<commit_message>
Fix XAMPP routing and clean URLs
</commit_message>
<xml_diff>
--- a/docs/JeePHP-Manual-Book-v1.0.0.docx
+++ b/docs/JeePHP-Manual-Book-v1.0.0.docx
@@ -92,7 +92,6 @@
           <w:rFonts w:ascii="DejaVu Sans Mono" w:hAnsi="DejaVu Sans Mono" w:eastAsia="DejaVu Sans Mono" w:cs="DejaVu Sans Mono"/>
           <w:color w:val="000000"/>
         </w:rPr>
-        <w:br w:type="page"/>
       </w:r>
     </w:p>
     <w:p>
@@ -685,7 +684,7 @@
           <w:rFonts w:ascii="DejaVu Sans Mono" w:hAnsi="DejaVu Sans Mono" w:eastAsia="DejaVu Sans Mono" w:cs="DejaVu Sans Mono"/>
           <w:color w:val="000000"/>
         </w:rPr>
-        <w:t>php jeep serve</w:t>
+        <w:t>php artisan serve</w:t>
       </w:r>
     </w:p>
     <w:p>
@@ -729,7 +728,7 @@
           <w:rFonts w:ascii="DejaVu Sans Mono" w:hAnsi="DejaVu Sans Mono" w:eastAsia="DejaVu Sans Mono" w:cs="DejaVu Sans Mono"/>
           <w:color w:val="000000"/>
         </w:rPr>
-        <w:t>php jeep create MyApp</w:t>
+        <w:t>php artisan create MyApp</w:t>
       </w:r>
     </w:p>
     <w:p>
@@ -771,16 +770,16 @@
           <w:rFonts w:ascii="DejaVu Sans Mono" w:hAnsi="DejaVu Sans Mono" w:eastAsia="DejaVu Sans Mono" w:cs="DejaVu Sans Mono"/>
           <w:color w:val="000000"/>
         </w:rPr>
-        <w:t>php jeep serve</w:t>
-      </w:r>
-    </w:p>
-    <w:p>
-      <w:r>
-        <w:rPr>
-          <w:rFonts w:ascii="DejaVu Sans Mono" w:hAnsi="DejaVu Sans Mono" w:eastAsia="DejaVu Sans Mono" w:cs="DejaVu Sans Mono"/>
-          <w:color w:val="000000"/>
-        </w:rPr>
-        <w:t>On Windows, run `jeep.bat serve` if PHP is on PATH, or run the PHP executable directly, for example `C:\xampp\php\php.exe jeep serve`.</w:t>
+        <w:t>php artisan serve</w:t>
+      </w:r>
+    </w:p>
+    <w:p>
+      <w:r>
+        <w:rPr>
+          <w:rFonts w:ascii="DejaVu Sans Mono" w:hAnsi="DejaVu Sans Mono" w:eastAsia="DejaVu Sans Mono" w:cs="DejaVu Sans Mono"/>
+          <w:color w:val="000000"/>
+        </w:rPr>
+        <w:t>On Windows, run `artisan.bat serve` if PHP is on PATH, or run the PHP executable directly, for example `C:\xampp\php\php.exe artisan serve`.</w:t>
       </w:r>
     </w:p>
     <w:p>
@@ -815,7 +814,7 @@
           <w:rFonts w:ascii="DejaVu Sans Mono" w:hAnsi="DejaVu Sans Mono" w:eastAsia="DejaVu Sans Mono" w:cs="DejaVu Sans Mono"/>
           <w:color w:val="000000"/>
         </w:rPr>
-        <w:t>`php jeep serve` uses the PHP built-in development server. PHP is still required; JeePHP is not a compiler and does not create a standalone executable. Do not use the built-in server as a production web server.</w:t>
+        <w:t>`php artisan serve` uses the PHP built-in development server. PHP is still required; JeePHP is not a compiler and does not create a standalone executable. Do not use the built-in server as a production web server.</w:t>
       </w:r>
     </w:p>
     <w:p>
@@ -1137,7 +1136,23 @@
           <w:rFonts w:ascii="DejaVu Sans Mono" w:hAnsi="DejaVu Sans Mono" w:eastAsia="DejaVu Sans Mono" w:cs="DejaVu Sans Mono"/>
           <w:color w:val="000000"/>
         </w:rPr>
-        <w:t>bin/jeep                CLI implementation</w:t>
+        <w:t>artisan                  Artisan-style command entry point</w:t>
+      </w:r>
+    </w:p>
+    <w:p>
+      <w:pPr>
+        <w:pStyle w:val="CodeBlock"/>
+      </w:pPr>
+      <w:r>
+        <w:t>artisan.bat              Windows command launcher</w:t>
+      </w:r>
+    </w:p>
+    <w:p>
+      <w:pPr>
+        <w:pStyle w:val="CodeBlock"/>
+      </w:pPr>
+      <w:r>
+        <w:t>bin/jeep                  Shared command implementation</w:t>
       </w:r>
     </w:p>
     <w:p>
@@ -1154,6 +1169,28 @@
         <w:pStyle w:val="Heading2"/>
       </w:pPr>
       <w:r>
+        <w:t>Artisan-style CLI</w:t>
+      </w:r>
+    </w:p>
+    <w:p>
+      <w:pPr/>
+      <w:r>
+        <w:t>JeePHP routes its existing framework commands through the Artisan-style php artisan entry point. Run it with no arguments, list, or --help to see the command list. All JeePHP commands shown in this book work through this entry point. On Windows, use artisan.bat. The legacy php jeep and jeep.bat launchers remain available.</w:t>
+      </w:r>
+    </w:p>
+    <w:p>
+      <w:pPr>
+        <w:pStyle w:val="CodeBlock"/>
+      </w:pPr>
+      <w:r>
+        <w:t>php artisan</w:t>
+      </w:r>
+    </w:p>
+    <w:p>
+      <w:pPr>
+        <w:pStyle w:val="Heading2"/>
+      </w:pPr>
+      <w:r>
         <w:rPr>
           <w:rFonts w:ascii="DejaVu Sans Mono" w:hAnsi="DejaVu Sans Mono" w:eastAsia="DejaVu Sans Mono" w:cs="DejaVu Sans Mono"/>
           <w:color w:val="000000"/>
@@ -1172,49 +1209,49 @@
           <w:rFonts w:ascii="DejaVu Sans Mono" w:hAnsi="DejaVu Sans Mono" w:eastAsia="DejaVu Sans Mono" w:cs="DejaVu Sans Mono"/>
           <w:color w:val="000000"/>
         </w:rPr>
-        <w:t>php jeep make:controller Customer</w:t>
-      </w:r>
-    </w:p>
-    <w:p>
-      <w:pPr>
-        <w:pStyle w:val="CodeBlock"/>
-        <w:keepLines/>
-        <w:shd w:fill="F3F3F3"/>
-      </w:pPr>
-      <w:r>
-        <w:rPr>
-          <w:rFonts w:ascii="DejaVu Sans Mono" w:hAnsi="DejaVu Sans Mono" w:eastAsia="DejaVu Sans Mono" w:cs="DejaVu Sans Mono"/>
-          <w:color w:val="000000"/>
-        </w:rPr>
-        <w:t>php jeep make:model Customer</w:t>
-      </w:r>
-    </w:p>
-    <w:p>
-      <w:pPr>
-        <w:pStyle w:val="CodeBlock"/>
-        <w:keepLines/>
-        <w:shd w:fill="F3F3F3"/>
-      </w:pPr>
-      <w:r>
-        <w:rPr>
-          <w:rFonts w:ascii="DejaVu Sans Mono" w:hAnsi="DejaVu Sans Mono" w:eastAsia="DejaVu Sans Mono" w:cs="DejaVu Sans Mono"/>
-          <w:color w:val="000000"/>
-        </w:rPr>
-        <w:t>php jeep make:logic RegisterCustomer</w:t>
-      </w:r>
-    </w:p>
-    <w:p>
-      <w:pPr>
-        <w:pStyle w:val="CodeBlock"/>
-        <w:keepLines/>
-        <w:shd w:fill="F3F3F3"/>
-      </w:pPr>
-      <w:r>
-        <w:rPr>
-          <w:rFonts w:ascii="DejaVu Sans Mono" w:hAnsi="DejaVu Sans Mono" w:eastAsia="DejaVu Sans Mono" w:cs="DejaVu Sans Mono"/>
-          <w:color w:val="000000"/>
-        </w:rPr>
-        <w:t>php jeep make:job DailyReport</w:t>
+        <w:t>php artisan make:controller Customer</w:t>
+      </w:r>
+    </w:p>
+    <w:p>
+      <w:pPr>
+        <w:pStyle w:val="CodeBlock"/>
+        <w:keepLines/>
+        <w:shd w:fill="F3F3F3"/>
+      </w:pPr>
+      <w:r>
+        <w:rPr>
+          <w:rFonts w:ascii="DejaVu Sans Mono" w:hAnsi="DejaVu Sans Mono" w:eastAsia="DejaVu Sans Mono" w:cs="DejaVu Sans Mono"/>
+          <w:color w:val="000000"/>
+        </w:rPr>
+        <w:t>php artisan make:model Customer</w:t>
+      </w:r>
+    </w:p>
+    <w:p>
+      <w:pPr>
+        <w:pStyle w:val="CodeBlock"/>
+        <w:keepLines/>
+        <w:shd w:fill="F3F3F3"/>
+      </w:pPr>
+      <w:r>
+        <w:rPr>
+          <w:rFonts w:ascii="DejaVu Sans Mono" w:hAnsi="DejaVu Sans Mono" w:eastAsia="DejaVu Sans Mono" w:cs="DejaVu Sans Mono"/>
+          <w:color w:val="000000"/>
+        </w:rPr>
+        <w:t>php artisan make:logic RegisterCustomer</w:t>
+      </w:r>
+    </w:p>
+    <w:p>
+      <w:pPr>
+        <w:pStyle w:val="CodeBlock"/>
+        <w:keepLines/>
+        <w:shd w:fill="F3F3F3"/>
+      </w:pPr>
+      <w:r>
+        <w:rPr>
+          <w:rFonts w:ascii="DejaVu Sans Mono" w:hAnsi="DejaVu Sans Mono" w:eastAsia="DejaVu Sans Mono" w:cs="DejaVu Sans Mono"/>
+          <w:color w:val="000000"/>
+        </w:rPr>
+        <w:t>php artisan make:job DailyReport</w:t>
       </w:r>
     </w:p>
     <w:p>
@@ -2511,21 +2548,21 @@
           <w:rFonts w:ascii="DejaVu Sans Mono" w:hAnsi="DejaVu Sans Mono" w:eastAsia="DejaVu Sans Mono" w:cs="DejaVu Sans Mono"/>
           <w:color w:val="000000"/>
         </w:rPr>
-        <w:t>php jeep migrate:create customers</w:t>
-      </w:r>
-    </w:p>
-    <w:p>
-      <w:pPr>
-        <w:pStyle w:val="CodeBlock"/>
-        <w:keepLines/>
-        <w:shd w:fill="F3F3F3"/>
-      </w:pPr>
-      <w:r>
-        <w:rPr>
-          <w:rFonts w:ascii="DejaVu Sans Mono" w:hAnsi="DejaVu Sans Mono" w:eastAsia="DejaVu Sans Mono" w:cs="DejaVu Sans Mono"/>
-          <w:color w:val="000000"/>
-        </w:rPr>
-        <w:t>php jeep migrate</w:t>
+        <w:t>php artisan migrate:create customers</w:t>
+      </w:r>
+    </w:p>
+    <w:p>
+      <w:pPr>
+        <w:pStyle w:val="CodeBlock"/>
+        <w:keepLines/>
+        <w:shd w:fill="F3F3F3"/>
+      </w:pPr>
+      <w:r>
+        <w:rPr>
+          <w:rFonts w:ascii="DejaVu Sans Mono" w:hAnsi="DejaVu Sans Mono" w:eastAsia="DejaVu Sans Mono" w:cs="DejaVu Sans Mono"/>
+          <w:color w:val="000000"/>
+        </w:rPr>
+        <w:t>php artisan migrate</w:t>
       </w:r>
     </w:p>
     <w:p>
@@ -2851,7 +2888,7 @@
           <w:rFonts w:ascii="DejaVu Sans Mono" w:hAnsi="DejaVu Sans Mono" w:eastAsia="DejaVu Sans Mono" w:cs="DejaVu Sans Mono"/>
           <w:color w:val="000000"/>
         </w:rPr>
-        <w:t>php jeep migrate:rollback</w:t>
+        <w:t>php artisan migrate:rollback</w:t>
       </w:r>
     </w:p>
     <w:p>
@@ -2898,7 +2935,7 @@
           <w:rFonts w:ascii="DejaVu Sans Mono" w:hAnsi="DejaVu Sans Mono" w:eastAsia="DejaVu Sans Mono" w:cs="DejaVu Sans Mono"/>
           <w:color w:val="000000"/>
         </w:rPr>
-        <w:t>php jeep migrate:create customers</w:t>
+        <w:t>php artisan migrate:create customers</w:t>
       </w:r>
     </w:p>
     <w:p>
@@ -2921,7 +2958,7 @@
           <w:rFonts w:ascii="DejaVu Sans Mono" w:hAnsi="DejaVu Sans Mono" w:eastAsia="DejaVu Sans Mono" w:cs="DejaVu Sans Mono"/>
           <w:color w:val="000000"/>
         </w:rPr>
-        <w:t>php jeep migrate</w:t>
+        <w:t>php artisan migrate</w:t>
       </w:r>
     </w:p>
     <w:p>
@@ -2947,7 +2984,7 @@
           <w:rFonts w:ascii="DejaVu Sans Mono" w:hAnsi="DejaVu Sans Mono" w:eastAsia="DejaVu Sans Mono" w:cs="DejaVu Sans Mono"/>
           <w:color w:val="000000"/>
         </w:rPr>
-        <w:t>php jeep make:model Customer</w:t>
+        <w:t>php artisan make:model Customer</w:t>
       </w:r>
     </w:p>
     <w:p>
@@ -5247,7 +5284,7 @@
           <w:rFonts w:ascii="DejaVu Sans Mono" w:hAnsi="DejaVu Sans Mono" w:eastAsia="DejaVu Sans Mono" w:cs="DejaVu Sans Mono"/>
           <w:color w:val="000000"/>
         </w:rPr>
-        <w:t>A model is a PHP class for a table. Generate one with `php jeep make:model Customer`, then set `$table` and `$fillable`. Use `Customer::find($id)`, `Customer::all()`, `Customer::create([...])`, `$model-&gt;update([...])`, `$model-&gt;delete()`, or `Customer::query()` for builder-based reads.</w:t>
+        <w:t>A model is a PHP class for a table. Generate one with `php artisan make:model Customer`, then set `$table` and `$fillable`. Use `Customer::find($id)`, `Customer::all()`, `Customer::create([...])`, `$model-&gt;update([...])`, `$model-&gt;delete()`, or `Customer::query()` for builder-based reads.</w:t>
       </w:r>
     </w:p>
     <w:p>
@@ -6064,7 +6101,7 @@
           <w:rFonts w:ascii="DejaVu Sans Mono" w:hAnsi="DejaVu Sans Mono" w:eastAsia="DejaVu Sans Mono" w:cs="DejaVu Sans Mono"/>
           <w:color w:val="000000"/>
         </w:rPr>
-        <w:t>php jeep make:logic RegisterCustomer</w:t>
+        <w:t>php artisan make:logic RegisterCustomer</w:t>
       </w:r>
     </w:p>
     <w:p>
@@ -6353,21 +6390,21 @@
           <w:rFonts w:ascii="DejaVu Sans Mono" w:hAnsi="DejaVu Sans Mono" w:eastAsia="DejaVu Sans Mono" w:cs="DejaVu Sans Mono"/>
           <w:color w:val="000000"/>
         </w:rPr>
-        <w:t>php jeep make:job DailyReport</w:t>
-      </w:r>
-    </w:p>
-    <w:p>
-      <w:pPr>
-        <w:pStyle w:val="CodeBlock"/>
-        <w:keepLines/>
-        <w:shd w:fill="F3F3F3"/>
-      </w:pPr>
-      <w:r>
-        <w:rPr>
-          <w:rFonts w:ascii="DejaVu Sans Mono" w:hAnsi="DejaVu Sans Mono" w:eastAsia="DejaVu Sans Mono" w:cs="DejaVu Sans Mono"/>
-          <w:color w:val="000000"/>
-        </w:rPr>
-        <w:t>php jeep job:run DailyReport</w:t>
+        <w:t>php artisan make:job DailyReport</w:t>
+      </w:r>
+    </w:p>
+    <w:p>
+      <w:pPr>
+        <w:pStyle w:val="CodeBlock"/>
+        <w:keepLines/>
+        <w:shd w:fill="F3F3F3"/>
+      </w:pPr>
+      <w:r>
+        <w:rPr>
+          <w:rFonts w:ascii="DejaVu Sans Mono" w:hAnsi="DejaVu Sans Mono" w:eastAsia="DejaVu Sans Mono" w:cs="DejaVu Sans Mono"/>
+          <w:color w:val="000000"/>
+        </w:rPr>
+        <w:t>php artisan job:run DailyReport</w:t>
       </w:r>
     </w:p>
     <w:p>
@@ -6390,7 +6427,7 @@
           <w:rFonts w:ascii="DejaVu Sans Mono" w:hAnsi="DejaVu Sans Mono" w:eastAsia="DejaVu Sans Mono" w:cs="DejaVu Sans Mono"/>
           <w:color w:val="000000"/>
         </w:rPr>
-        <w:t>php jeep activate QueueO</w:t>
+        <w:t>php artisan activate QueueO</w:t>
       </w:r>
     </w:p>
     <w:p>
@@ -6418,21 +6455,21 @@
           <w:rFonts w:ascii="DejaVu Sans Mono" w:hAnsi="DejaVu Sans Mono" w:eastAsia="DejaVu Sans Mono" w:cs="DejaVu Sans Mono"/>
           <w:color w:val="000000"/>
         </w:rPr>
-        <w:t>php jeep migrate</w:t>
-      </w:r>
-    </w:p>
-    <w:p>
-      <w:pPr>
-        <w:pStyle w:val="CodeBlock"/>
-        <w:keepLines/>
-        <w:shd w:fill="F3F3F3"/>
-      </w:pPr>
-      <w:r>
-        <w:rPr>
-          <w:rFonts w:ascii="DejaVu Sans Mono" w:hAnsi="DejaVu Sans Mono" w:eastAsia="DejaVu Sans Mono" w:cs="DejaVu Sans Mono"/>
-          <w:color w:val="000000"/>
-        </w:rPr>
-        <w:t>php jeep make:job SendReceipt</w:t>
+        <w:t>php artisan migrate</w:t>
+      </w:r>
+    </w:p>
+    <w:p>
+      <w:pPr>
+        <w:pStyle w:val="CodeBlock"/>
+        <w:keepLines/>
+        <w:shd w:fill="F3F3F3"/>
+      </w:pPr>
+      <w:r>
+        <w:rPr>
+          <w:rFonts w:ascii="DejaVu Sans Mono" w:hAnsi="DejaVu Sans Mono" w:eastAsia="DejaVu Sans Mono" w:cs="DejaVu Sans Mono"/>
+          <w:color w:val="000000"/>
+        </w:rPr>
+        <w:t>php artisan make:job SendReceipt</w:t>
       </w:r>
     </w:p>
     <w:p>
@@ -6483,44 +6520,44 @@
           <w:rFonts w:ascii="DejaVu Sans Mono" w:hAnsi="DejaVu Sans Mono" w:eastAsia="DejaVu Sans Mono" w:cs="DejaVu Sans Mono"/>
           <w:color w:val="000000"/>
         </w:rPr>
-        <w:t>php jeep queue:work</w:t>
-      </w:r>
-    </w:p>
-    <w:p>
-      <w:pPr>
-        <w:pStyle w:val="CodeBlock"/>
-        <w:keepLines/>
-        <w:shd w:fill="F3F3F3"/>
-      </w:pPr>
-      <w:r>
-        <w:rPr>
-          <w:rFonts w:ascii="DejaVu Sans Mono" w:hAnsi="DejaVu Sans Mono" w:eastAsia="DejaVu Sans Mono" w:cs="DejaVu Sans Mono"/>
-          <w:color w:val="000000"/>
-        </w:rPr>
-        <w:t>php jeep queue:failed</w:t>
-      </w:r>
-    </w:p>
-    <w:p>
-      <w:pPr>
-        <w:pStyle w:val="CodeBlock"/>
-        <w:keepLines/>
-        <w:shd w:fill="F3F3F3"/>
-      </w:pPr>
-      <w:r>
-        <w:rPr>
-          <w:rFonts w:ascii="DejaVu Sans Mono" w:hAnsi="DejaVu Sans Mono" w:eastAsia="DejaVu Sans Mono" w:cs="DejaVu Sans Mono"/>
-          <w:color w:val="000000"/>
-        </w:rPr>
-        <w:t>php jeep queue:retry JOB_ID</w:t>
-      </w:r>
-    </w:p>
-    <w:p>
-      <w:r>
-        <w:rPr>
-          <w:rFonts w:ascii="DejaVu Sans Mono" w:hAnsi="DejaVu Sans Mono" w:eastAsia="DejaVu Sans Mono" w:cs="DejaVu Sans Mono"/>
-          <w:color w:val="000000"/>
-        </w:rPr>
-        <w:t>QueueO saves jobs in MySQL/MariaDB, reserves one job at a time, retries failures up to the configured limit, and keeps exhausted jobs for inspection. `php jeep queue:work --once` processes at most one ready job. Use a process manager for a production worker.</w:t>
+        <w:t>php artisan queue:work</w:t>
+      </w:r>
+    </w:p>
+    <w:p>
+      <w:pPr>
+        <w:pStyle w:val="CodeBlock"/>
+        <w:keepLines/>
+        <w:shd w:fill="F3F3F3"/>
+      </w:pPr>
+      <w:r>
+        <w:rPr>
+          <w:rFonts w:ascii="DejaVu Sans Mono" w:hAnsi="DejaVu Sans Mono" w:eastAsia="DejaVu Sans Mono" w:cs="DejaVu Sans Mono"/>
+          <w:color w:val="000000"/>
+        </w:rPr>
+        <w:t>php artisan queue:failed</w:t>
+      </w:r>
+    </w:p>
+    <w:p>
+      <w:pPr>
+        <w:pStyle w:val="CodeBlock"/>
+        <w:keepLines/>
+        <w:shd w:fill="F3F3F3"/>
+      </w:pPr>
+      <w:r>
+        <w:rPr>
+          <w:rFonts w:ascii="DejaVu Sans Mono" w:hAnsi="DejaVu Sans Mono" w:eastAsia="DejaVu Sans Mono" w:cs="DejaVu Sans Mono"/>
+          <w:color w:val="000000"/>
+        </w:rPr>
+        <w:t>php artisan queue:retry JOB_ID</w:t>
+      </w:r>
+    </w:p>
+    <w:p>
+      <w:r>
+        <w:rPr>
+          <w:rFonts w:ascii="DejaVu Sans Mono" w:hAnsi="DejaVu Sans Mono" w:eastAsia="DejaVu Sans Mono" w:cs="DejaVu Sans Mono"/>
+          <w:color w:val="000000"/>
+        </w:rPr>
+        <w:t>QueueO saves jobs in MySQL/MariaDB, reserves one job at a time, retries failures up to the configured limit, and keeps exhausted jobs for inspection. `php artisan queue:work --once` processes at most one ready job. Use a process manager for a production worker.</w:t>
       </w:r>
     </w:p>
     <w:p>
@@ -6541,7 +6578,7 @@
           <w:rFonts w:ascii="DejaVu Sans Mono" w:hAnsi="DejaVu Sans Mono" w:eastAsia="DejaVu Sans Mono" w:cs="DejaVu Sans Mono"/>
           <w:color w:val="000000"/>
         </w:rPr>
-        <w:t>Activate ScheduleO, add a task to `config/schedule.php`, and run `php jeep schedule:run` once a minute from Linux cron or Windows Task Scheduler. `every_seconds` supports values from 60 seconds to one year. Due jobs are queued if QueueO is active; otherwise they run inside the scheduler command.</w:t>
+        <w:t>Activate ScheduleO, add a task to `config/schedule.php`, and run `php artisan schedule:run` once a minute from Linux cron or Windows Task Scheduler. `every_seconds` supports values from 60 seconds to one year. Due jobs are queued if QueueO is active; otherwise they run inside the scheduler command.</w:t>
       </w:r>
     </w:p>
     <w:p>
@@ -6627,7 +6664,7 @@
           <w:rFonts w:ascii="DejaVu Sans Mono" w:hAnsi="DejaVu Sans Mono" w:eastAsia="DejaVu Sans Mono" w:cs="DejaVu Sans Mono"/>
           <w:color w:val="000000"/>
         </w:rPr>
-        <w:t>php jeep activate MailO</w:t>
+        <w:t>php artisan activate MailO</w:t>
       </w:r>
     </w:p>
     <w:p>
@@ -6757,7 +6794,7 @@
           <w:rFonts w:ascii="DejaVu Sans Mono" w:hAnsi="DejaVu Sans Mono" w:eastAsia="DejaVu Sans Mono" w:cs="DejaVu Sans Mono"/>
           <w:color w:val="000000"/>
         </w:rPr>
-        <w:t>Create a PHP template under `app/Views/emails/`, escape user values with `e()`, and send it with `send_mail($to, $subject, $viewName, $data)`. Test with `php jeep mail:test user@example.com`. AuthO password reset and email verification need MailO to deliver their messages.</w:t>
+        <w:t>Create a PHP template under `app/Views/emails/`, escape user values with `e()`, and send it with `send_mail($to, $subject, $viewName, $data)`. Test with `php artisan mail:test user@example.com`. AuthO password reset and email verification need MailO to deliver their messages.</w:t>
       </w:r>
     </w:p>
     <w:p>
@@ -7074,44 +7111,44 @@
           <w:rFonts w:ascii="DejaVu Sans Mono" w:hAnsi="DejaVu Sans Mono" w:eastAsia="DejaVu Sans Mono" w:cs="DejaVu Sans Mono"/>
           <w:color w:val="000000"/>
         </w:rPr>
-        <w:t>php jeep activate AuthO</w:t>
-      </w:r>
-    </w:p>
-    <w:p>
-      <w:pPr>
-        <w:pStyle w:val="CodeBlock"/>
-        <w:keepLines/>
-        <w:shd w:fill="F3F3F3"/>
-      </w:pPr>
-      <w:r>
-        <w:rPr>
-          <w:rFonts w:ascii="DejaVu Sans Mono" w:hAnsi="DejaVu Sans Mono" w:eastAsia="DejaVu Sans Mono" w:cs="DejaVu Sans Mono"/>
-          <w:color w:val="000000"/>
-        </w:rPr>
-        <w:t>php jeep activate RolesO</w:t>
-      </w:r>
-    </w:p>
-    <w:p>
-      <w:pPr>
-        <w:pStyle w:val="CodeBlock"/>
-        <w:keepLines/>
-        <w:shd w:fill="F3F3F3"/>
-      </w:pPr>
-      <w:r>
-        <w:rPr>
-          <w:rFonts w:ascii="DejaVu Sans Mono" w:hAnsi="DejaVu Sans Mono" w:eastAsia="DejaVu Sans Mono" w:cs="DejaVu Sans Mono"/>
-          <w:color w:val="000000"/>
-        </w:rPr>
-        <w:t>php jeep --version</w:t>
-      </w:r>
-    </w:p>
-    <w:p>
-      <w:r>
-        <w:rPr>
-          <w:rFonts w:ascii="DejaVu Sans Mono" w:hAnsi="DejaVu Sans Mono" w:eastAsia="DejaVu Sans Mono" w:cs="DejaVu Sans Mono"/>
-          <w:color w:val="000000"/>
-        </w:rPr>
-        <w:t>Activation adds reviewed files under `app/`, adds routes to `routes/web.php`, adds helper functions to `app/Helpers/helpers.php`, and creates a migration in `database/migrations/`. Existing app files are not overwritten; if a generated file already exists, activation stops so you can resolve the conflict. Run `composer dump-autoload` and then `php jeep migrate` to register helpers and create the tables.</w:t>
+        <w:t>php artisan activate AuthO</w:t>
+      </w:r>
+    </w:p>
+    <w:p>
+      <w:pPr>
+        <w:pStyle w:val="CodeBlock"/>
+        <w:keepLines/>
+        <w:shd w:fill="F3F3F3"/>
+      </w:pPr>
+      <w:r>
+        <w:rPr>
+          <w:rFonts w:ascii="DejaVu Sans Mono" w:hAnsi="DejaVu Sans Mono" w:eastAsia="DejaVu Sans Mono" w:cs="DejaVu Sans Mono"/>
+          <w:color w:val="000000"/>
+        </w:rPr>
+        <w:t>php artisan activate RolesO</w:t>
+      </w:r>
+    </w:p>
+    <w:p>
+      <w:pPr>
+        <w:pStyle w:val="CodeBlock"/>
+        <w:keepLines/>
+        <w:shd w:fill="F3F3F3"/>
+      </w:pPr>
+      <w:r>
+        <w:rPr>
+          <w:rFonts w:ascii="DejaVu Sans Mono" w:hAnsi="DejaVu Sans Mono" w:eastAsia="DejaVu Sans Mono" w:cs="DejaVu Sans Mono"/>
+          <w:color w:val="000000"/>
+        </w:rPr>
+        <w:t>php artisan --version</w:t>
+      </w:r>
+    </w:p>
+    <w:p>
+      <w:r>
+        <w:rPr>
+          <w:rFonts w:ascii="DejaVu Sans Mono" w:hAnsi="DejaVu Sans Mono" w:eastAsia="DejaVu Sans Mono" w:cs="DejaVu Sans Mono"/>
+          <w:color w:val="000000"/>
+        </w:rPr>
+        <w:t>Activation adds reviewed files under `app/`, adds routes to `routes/web.php`, adds helper functions to `app/Helpers/helpers.php`, and creates a migration in `database/migrations/`. Existing app files are not overwritten; if a generated file already exists, activation stops so you can resolve the conflict. Run `composer dump-autoload` and then `php artisan migrate` to register helpers and create the tables.</w:t>
       </w:r>
     </w:p>
     <w:p>
@@ -7218,21 +7255,21 @@
           <w:rFonts w:ascii="DejaVu Sans Mono" w:hAnsi="DejaVu Sans Mono" w:eastAsia="DejaVu Sans Mono" w:cs="DejaVu Sans Mono"/>
           <w:color w:val="000000"/>
         </w:rPr>
-        <w:t>php jeep role:assign 1 admin</w:t>
-      </w:r>
-    </w:p>
-    <w:p>
-      <w:pPr>
-        <w:pStyle w:val="CodeBlock"/>
-        <w:keepLines/>
-        <w:shd w:fill="F3F3F3"/>
-      </w:pPr>
-      <w:r>
-        <w:rPr>
-          <w:rFonts w:ascii="DejaVu Sans Mono" w:hAnsi="DejaVu Sans Mono" w:eastAsia="DejaVu Sans Mono" w:cs="DejaVu Sans Mono"/>
-          <w:color w:val="000000"/>
-        </w:rPr>
-        <w:t>php jeep permission:grant admin roles.manage</w:t>
+        <w:t>php artisan role:assign 1 admin</w:t>
+      </w:r>
+    </w:p>
+    <w:p>
+      <w:pPr>
+        <w:pStyle w:val="CodeBlock"/>
+        <w:keepLines/>
+        <w:shd w:fill="F3F3F3"/>
+      </w:pPr>
+      <w:r>
+        <w:rPr>
+          <w:rFonts w:ascii="DejaVu Sans Mono" w:hAnsi="DejaVu Sans Mono" w:eastAsia="DejaVu Sans Mono" w:cs="DejaVu Sans Mono"/>
+          <w:color w:val="000000"/>
+        </w:rPr>
+        <w:t>php artisan permission:grant admin roles.manage</w:t>
       </w:r>
     </w:p>
     <w:p>
@@ -7306,7 +7343,7 @@
           <w:rFonts w:ascii="DejaVu Sans Mono" w:hAnsi="DejaVu Sans Mono" w:eastAsia="DejaVu Sans Mono" w:cs="DejaVu Sans Mono"/>
           <w:color w:val="000000"/>
         </w:rPr>
-        <w:t>Call `user_can()` or `user_has_role()` in every protected controller/action. Hiding a button in a view does not protect its route. Run `php jeep activate RolesO` only after deciding which authenticated users should administer permissions.</w:t>
+        <w:t>Call `user_can()` or `user_has_role()` in every protected controller/action. Hiding a button in a view does not protect its route. Run `php artisan activate RolesO` only after deciding which authenticated users should administer permissions.</w:t>
       </w:r>
     </w:p>
     <w:p>
@@ -7487,11 +7524,7 @@
     </w:p>
     <w:p>
       <w:r>
-        <w:rPr>
-          <w:rFonts w:ascii="DejaVu Sans Mono" w:hAnsi="DejaVu Sans Mono" w:eastAsia="DejaVu Sans Mono" w:cs="DejaVu Sans Mono"/>
-          <w:color w:val="000000"/>
-        </w:rPr>
-        <w:t>The project-root `.htaccess` helps route local Apache traffic into `public/`. Production server setup depends on the hosting environment; follow its documented PHP-FPM/Apache/Nginx configuration.</w:t>
+        <w:t>The project root index.php provides a local XAMPP fallback, while `.htaccess` routes clean URLs into public/. For XAMPP, enable mod_rewrite and allow .htaccess overrides. Production servers should point their document root directly to public/.</w:t>
       </w:r>
     </w:p>
     <w:p>
@@ -7511,6 +7544,20 @@
         <w:pStyle w:val="Heading2"/>
       </w:pPr>
       <w:r>
+        <w:t>XAMPP opens app/Views instead of the welcome page</w:t>
+      </w:r>
+    </w:p>
+    <w:p>
+      <w:pPr/>
+      <w:r>
+        <w:t>Open http://localhost/MyApp/; never open app/Views or a view file as a URL. If the app/Views folder or a directory listing appears, Apache is ignoring the project .htaccess. In C:/xampp/apache/conf/httpd.conf, enable LoadModule rewrite_module modules/mod_rewrite.so and set the C:/xampp/htdocs Directory block to AllowOverride All, then restart Apache. The root .htaccess routes / to the welcome page and blocks framework source folders. Root index.php can show the welcome page without rewrites, but clean routes and source-folder protection need the Apache settings.</w:t>
+      </w:r>
+    </w:p>
+    <w:p>
+      <w:pPr>
+        <w:pStyle w:val="Heading2"/>
+      </w:pPr>
+      <w:r>
         <w:rPr>
           <w:rFonts w:ascii="DejaVu Sans Mono" w:hAnsi="DejaVu Sans Mono" w:eastAsia="DejaVu Sans Mono" w:cs="DejaVu Sans Mono"/>
           <w:color w:val="000000"/>
@@ -7650,7 +7697,7 @@
           <w:rFonts w:ascii="DejaVu Sans Mono" w:hAnsi="DejaVu Sans Mono" w:eastAsia="DejaVu Sans Mono" w:cs="DejaVu Sans Mono"/>
           <w:color w:val="000000"/>
         </w:rPr>
-        <w:t>Confirm MailO is active, run `composer update`, check the SMTP values and sender address in `.duck`, and use `php jeep mail:test your-address@example.com`. Check the provider’s SMTP port and TLS settings.</w:t>
+        <w:t>Confirm MailO is active, run `composer update`, check the SMTP values and sender address in `.duck`, and use `php artisan mail:test your-address@example.com`. Check the provider’s SMTP port and TLS settings.</w:t>
       </w:r>
     </w:p>
     <w:p>
@@ -7671,7 +7718,7 @@
           <w:rFonts w:ascii="DejaVu Sans Mono" w:hAnsi="DejaVu Sans Mono" w:eastAsia="DejaVu Sans Mono" w:cs="DejaVu Sans Mono"/>
           <w:color w:val="000000"/>
         </w:rPr>
-        <w:t>Run `php jeep package:list` to review available features. Activation copies scaffold files and writes an active marker. It does not run migrations. Existing application files are never overwritten. After activation, follow the CLI next steps: run `composer update` if composer.json changed, run `composer dump-autoload`, inspect any generated migration, and then run `php jeep migrate`.</w:t>
+        <w:t>Run `php artisan package:list` to review available features. Activation copies scaffold files and writes an active marker. It does not run migrations. Existing application files are never overwritten. After activation, follow the CLI next steps: run `composer update` if composer.json changed, run `composer dump-autoload`, inspect any generated migration, and then run `php artisan migrate`.</w:t>
       </w:r>
     </w:p>
     <w:p>
@@ -7757,7 +7804,7 @@
           <w:rFonts w:ascii="DejaVu Sans Mono" w:hAnsi="DejaVu Sans Mono" w:eastAsia="DejaVu Sans Mono" w:cs="DejaVu Sans Mono"/>
           <w:color w:val="000000"/>
         </w:rPr>
-        <w:t>ScheduleO: `config/schedule.php` and `php jeep schedule:run`.</w:t>
+        <w:t>ScheduleO: `config/schedule.php` and `php artisan schedule:run`.</w:t>
       </w:r>
     </w:p>
     <w:p>
@@ -7770,7 +7817,7 @@
           <w:rFonts w:ascii="DejaVu Sans Mono" w:hAnsi="DejaVu Sans Mono" w:eastAsia="DejaVu Sans Mono" w:cs="DejaVu Sans Mono"/>
           <w:color w:val="000000"/>
         </w:rPr>
-        <w:t>TestO: `php jeep make:test` and a small custom test runner (`php jeep test`), not PHPUnit.</w:t>
+        <w:t>TestO: `php artisan make:test` and a small custom test runner (`php artisan test`), not PHPUnit.</w:t>
       </w:r>
     </w:p>
     <w:p>
@@ -7822,7 +7869,7 @@
           <w:rFonts w:ascii="DejaVu Sans Mono" w:hAnsi="DejaVu Sans Mono" w:eastAsia="DejaVu Sans Mono" w:cs="DejaVu Sans Mono"/>
           <w:color w:val="000000"/>
         </w:rPr>
-        <w:t>CrudO: `php jeep make:crud Product name,price,description` generates a starter CRUD module.</w:t>
+        <w:t>CrudO: `php artisan make:crud Product name,price,description` generates a starter CRUD module.</w:t>
       </w:r>
     </w:p>
     <w:p>
@@ -7913,7 +7960,7 @@
           <w:rFonts w:ascii="DejaVu Sans Mono" w:hAnsi="DejaVu Sans Mono" w:eastAsia="DejaVu Sans Mono" w:cs="DejaVu Sans Mono"/>
           <w:color w:val="000000"/>
         </w:rPr>
-        <w:t>php jeep activate APIO</w:t>
+        <w:t>php artisan activate APIO</w:t>
       </w:r>
     </w:p>
     <w:p>
@@ -7941,30 +7988,30 @@
           <w:rFonts w:ascii="DejaVu Sans Mono" w:hAnsi="DejaVu Sans Mono" w:eastAsia="DejaVu Sans Mono" w:cs="DejaVu Sans Mono"/>
           <w:color w:val="000000"/>
         </w:rPr>
-        <w:t>php jeep migrate</w:t>
-      </w:r>
-    </w:p>
-    <w:p>
-      <w:pPr>
-        <w:pStyle w:val="CodeBlock"/>
-        <w:keepLines/>
-        <w:shd w:fill="F3F3F3"/>
-      </w:pPr>
-      <w:r>
-        <w:rPr>
-          <w:rFonts w:ascii="DejaVu Sans Mono" w:hAnsi="DejaVu Sans Mono" w:eastAsia="DejaVu Sans Mono" w:cs="DejaVu Sans Mono"/>
-          <w:color w:val="000000"/>
-        </w:rPr>
-        <w:t>php jeep api:token USER_ID mobile-app users.read,users.write</w:t>
-      </w:r>
-    </w:p>
-    <w:p>
-      <w:r>
-        <w:rPr>
-          <w:rFonts w:ascii="DejaVu Sans Mono" w:hAnsi="DejaVu Sans Mono" w:eastAsia="DejaVu Sans Mono" w:cs="DejaVu Sans Mono"/>
-          <w:color w:val="000000"/>
-        </w:rPr>
-        <w:t>Copy the token printed by the command; it is only shown once. Send it only over HTTPS in the Authorization header. In each API controller, call `api_require('users.read')` and return if it gives null. `*` means every ability, so avoid it unless required. Revoke a token with `php jeep api:revoke TOKEN_ID USER_ID`.</w:t>
+        <w:t>php artisan migrate</w:t>
+      </w:r>
+    </w:p>
+    <w:p>
+      <w:pPr>
+        <w:pStyle w:val="CodeBlock"/>
+        <w:keepLines/>
+        <w:shd w:fill="F3F3F3"/>
+      </w:pPr>
+      <w:r>
+        <w:rPr>
+          <w:rFonts w:ascii="DejaVu Sans Mono" w:hAnsi="DejaVu Sans Mono" w:eastAsia="DejaVu Sans Mono" w:cs="DejaVu Sans Mono"/>
+          <w:color w:val="000000"/>
+        </w:rPr>
+        <w:t>php artisan api:token USER_ID mobile-app users.read,users.write</w:t>
+      </w:r>
+    </w:p>
+    <w:p>
+      <w:r>
+        <w:rPr>
+          <w:rFonts w:ascii="DejaVu Sans Mono" w:hAnsi="DejaVu Sans Mono" w:eastAsia="DejaVu Sans Mono" w:cs="DejaVu Sans Mono"/>
+          <w:color w:val="000000"/>
+        </w:rPr>
+        <w:t>Copy the token printed by the command; it is only shown once. Send it only over HTTPS in the Authorization header. In each API controller, call `api_require('users.read')` and return if it gives null. `*` means every ability, so avoid it unless required. Revoke a token with `php artisan api:revoke TOKEN_ID USER_ID`.</w:t>
       </w:r>
     </w:p>
     <w:p>
@@ -7990,21 +8037,21 @@
           <w:rFonts w:ascii="DejaVu Sans Mono" w:hAnsi="DejaVu Sans Mono" w:eastAsia="DejaVu Sans Mono" w:cs="DejaVu Sans Mono"/>
           <w:color w:val="000000"/>
         </w:rPr>
-        <w:t>php jeep activate ValidateO</w:t>
-      </w:r>
-    </w:p>
-    <w:p>
-      <w:pPr>
-        <w:pStyle w:val="CodeBlock"/>
-        <w:keepLines/>
-        <w:shd w:fill="F3F3F3"/>
-      </w:pPr>
-      <w:r>
-        <w:rPr>
-          <w:rFonts w:ascii="DejaVu Sans Mono" w:hAnsi="DejaVu Sans Mono" w:eastAsia="DejaVu Sans Mono" w:cs="DejaVu Sans Mono"/>
-          <w:color w:val="000000"/>
-        </w:rPr>
-        <w:t>php jeep activate CrudO</w:t>
+        <w:t>php artisan activate ValidateO</w:t>
+      </w:r>
+    </w:p>
+    <w:p>
+      <w:pPr>
+        <w:pStyle w:val="CodeBlock"/>
+        <w:keepLines/>
+        <w:shd w:fill="F3F3F3"/>
+      </w:pPr>
+      <w:r>
+        <w:rPr>
+          <w:rFonts w:ascii="DejaVu Sans Mono" w:hAnsi="DejaVu Sans Mono" w:eastAsia="DejaVu Sans Mono" w:cs="DejaVu Sans Mono"/>
+          <w:color w:val="000000"/>
+        </w:rPr>
+        <w:t>php artisan activate CrudO</w:t>
       </w:r>
     </w:p>
     <w:p>
@@ -8032,21 +8079,21 @@
           <w:rFonts w:ascii="DejaVu Sans Mono" w:hAnsi="DejaVu Sans Mono" w:eastAsia="DejaVu Sans Mono" w:cs="DejaVu Sans Mono"/>
           <w:color w:val="000000"/>
         </w:rPr>
-        <w:t>php jeep make:crud Product name,price,description</w:t>
-      </w:r>
-    </w:p>
-    <w:p>
-      <w:pPr>
-        <w:pStyle w:val="CodeBlock"/>
-        <w:keepLines/>
-        <w:shd w:fill="F3F3F3"/>
-      </w:pPr>
-      <w:r>
-        <w:rPr>
-          <w:rFonts w:ascii="DejaVu Sans Mono" w:hAnsi="DejaVu Sans Mono" w:eastAsia="DejaVu Sans Mono" w:cs="DejaVu Sans Mono"/>
-          <w:color w:val="000000"/>
-        </w:rPr>
-        <w:t>php jeep migrate</w:t>
+        <w:t>php artisan make:crud Product name,price,description</w:t>
+      </w:r>
+    </w:p>
+    <w:p>
+      <w:pPr>
+        <w:pStyle w:val="CodeBlock"/>
+        <w:keepLines/>
+        <w:shd w:fill="F3F3F3"/>
+      </w:pPr>
+      <w:r>
+        <w:rPr>
+          <w:rFonts w:ascii="DejaVu Sans Mono" w:hAnsi="DejaVu Sans Mono" w:eastAsia="DejaVu Sans Mono" w:cs="DejaVu Sans Mono"/>
+          <w:color w:val="000000"/>
+        </w:rPr>
+        <w:t>php artisan migrate</w:t>
       </w:r>
     </w:p>
     <w:p>
@@ -8102,7 +8149,7 @@
           <w:rFonts w:ascii="DejaVu Sans Mono" w:hAnsi="DejaVu Sans Mono" w:eastAsia="DejaVu Sans Mono" w:cs="DejaVu Sans Mono"/>
           <w:color w:val="000000"/>
         </w:rPr>
-        <w:t>php jeep activate BackupO</w:t>
+        <w:t>php artisan activate BackupO</w:t>
       </w:r>
     </w:p>
     <w:p>
@@ -8130,7 +8177,7 @@
           <w:rFonts w:ascii="DejaVu Sans Mono" w:hAnsi="DejaVu Sans Mono" w:eastAsia="DejaVu Sans Mono" w:cs="DejaVu Sans Mono"/>
           <w:color w:val="000000"/>
         </w:rPr>
-        <w:t>php jeep backup:key-generate</w:t>
+        <w:t>php artisan backup:key-generate</w:t>
       </w:r>
     </w:p>
     <w:p>
@@ -8190,7 +8237,7 @@
           <w:rFonts w:ascii="DejaVu Sans Mono" w:hAnsi="DejaVu Sans Mono" w:eastAsia="DejaVu Sans Mono" w:cs="DejaVu Sans Mono"/>
           <w:color w:val="000000"/>
         </w:rPr>
-        <w:t>From the JeePHP project root, run `php jeep drive:connect path/to/oauth-client.json`.</w:t>
+        <w:t>From the JeePHP project root, run `php artisan drive:connect path/to/oauth-client.json`.</w:t>
       </w:r>
     </w:p>
     <w:p>
@@ -8216,7 +8263,7 @@
           <w:rFonts w:ascii="DejaVu Sans Mono" w:hAnsi="DejaVu Sans Mono" w:eastAsia="DejaVu Sans Mono" w:cs="DejaVu Sans Mono"/>
           <w:color w:val="000000"/>
         </w:rPr>
-        <w:t>Run `php jeep drive:status` to confirm the local authorization file exists.</w:t>
+        <w:t>Run `php artisan drive:status` to confirm the local authorization file exists.</w:t>
       </w:r>
     </w:p>
     <w:p>
@@ -8251,49 +8298,49 @@
           <w:rFonts w:ascii="DejaVu Sans Mono" w:hAnsi="DejaVu Sans Mono" w:eastAsia="DejaVu Sans Mono" w:cs="DejaVu Sans Mono"/>
           <w:color w:val="000000"/>
         </w:rPr>
-        <w:t>php jeep backup:database</w:t>
-      </w:r>
-    </w:p>
-    <w:p>
-      <w:pPr>
-        <w:pStyle w:val="CodeBlock"/>
-        <w:keepLines/>
-        <w:shd w:fill="F3F3F3"/>
-      </w:pPr>
-      <w:r>
-        <w:rPr>
-          <w:rFonts w:ascii="DejaVu Sans Mono" w:hAnsi="DejaVu Sans Mono" w:eastAsia="DejaVu Sans Mono" w:cs="DejaVu Sans Mono"/>
-          <w:color w:val="000000"/>
-        </w:rPr>
-        <w:t>php jeep backup:database --drive</w:t>
-      </w:r>
-    </w:p>
-    <w:p>
-      <w:pPr>
-        <w:pStyle w:val="CodeBlock"/>
-        <w:keepLines/>
-        <w:shd w:fill="F3F3F3"/>
-      </w:pPr>
-      <w:r>
-        <w:rPr>
-          <w:rFonts w:ascii="DejaVu Sans Mono" w:hAnsi="DejaVu Sans Mono" w:eastAsia="DejaVu Sans Mono" w:cs="DejaVu Sans Mono"/>
-          <w:color w:val="000000"/>
-        </w:rPr>
-        <w:t>php jeep backup:list</w:t>
-      </w:r>
-    </w:p>
-    <w:p>
-      <w:pPr>
-        <w:pStyle w:val="CodeBlock"/>
-        <w:keepLines/>
-        <w:shd w:fill="F3F3F3"/>
-      </w:pPr>
-      <w:r>
-        <w:rPr>
-          <w:rFonts w:ascii="DejaVu Sans Mono" w:hAnsi="DejaVu Sans Mono" w:eastAsia="DejaVu Sans Mono" w:cs="DejaVu Sans Mono"/>
-          <w:color w:val="000000"/>
-        </w:rPr>
-        <w:t>php jeep backup:list --drive</w:t>
+        <w:t>php artisan backup:database</w:t>
+      </w:r>
+    </w:p>
+    <w:p>
+      <w:pPr>
+        <w:pStyle w:val="CodeBlock"/>
+        <w:keepLines/>
+        <w:shd w:fill="F3F3F3"/>
+      </w:pPr>
+      <w:r>
+        <w:rPr>
+          <w:rFonts w:ascii="DejaVu Sans Mono" w:hAnsi="DejaVu Sans Mono" w:eastAsia="DejaVu Sans Mono" w:cs="DejaVu Sans Mono"/>
+          <w:color w:val="000000"/>
+        </w:rPr>
+        <w:t>php artisan backup:database --drive</w:t>
+      </w:r>
+    </w:p>
+    <w:p>
+      <w:pPr>
+        <w:pStyle w:val="CodeBlock"/>
+        <w:keepLines/>
+        <w:shd w:fill="F3F3F3"/>
+      </w:pPr>
+      <w:r>
+        <w:rPr>
+          <w:rFonts w:ascii="DejaVu Sans Mono" w:hAnsi="DejaVu Sans Mono" w:eastAsia="DejaVu Sans Mono" w:cs="DejaVu Sans Mono"/>
+          <w:color w:val="000000"/>
+        </w:rPr>
+        <w:t>php artisan backup:list</w:t>
+      </w:r>
+    </w:p>
+    <w:p>
+      <w:pPr>
+        <w:pStyle w:val="CodeBlock"/>
+        <w:keepLines/>
+        <w:shd w:fill="F3F3F3"/>
+      </w:pPr>
+      <w:r>
+        <w:rPr>
+          <w:rFonts w:ascii="DejaVu Sans Mono" w:hAnsi="DejaVu Sans Mono" w:eastAsia="DejaVu Sans Mono" w:cs="DejaVu Sans Mono"/>
+          <w:color w:val="000000"/>
+        </w:rPr>
+        <w:t>php artisan backup:list --drive</w:t>
       </w:r>
     </w:p>
     <w:p>
@@ -8328,63 +8375,63 @@
           <w:rFonts w:ascii="DejaVu Sans Mono" w:hAnsi="DejaVu Sans Mono" w:eastAsia="DejaVu Sans Mono" w:cs="DejaVu Sans Mono"/>
           <w:color w:val="000000"/>
         </w:rPr>
-        <w:t>php jeep backup:restore BACKUP_FILE.sql.gz.enc --force</w:t>
-      </w:r>
-    </w:p>
-    <w:p>
-      <w:pPr>
-        <w:pStyle w:val="CodeBlock"/>
-        <w:keepLines/>
-        <w:shd w:fill="F3F3F3"/>
-      </w:pPr>
-      <w:r>
-        <w:rPr>
-          <w:rFonts w:ascii="DejaVu Sans Mono" w:hAnsi="DejaVu Sans Mono" w:eastAsia="DejaVu Sans Mono" w:cs="DejaVu Sans Mono"/>
-          <w:color w:val="000000"/>
-        </w:rPr>
-        <w:t>php jeep backup:restore --drive DRIVE_FILE_ID --force</w:t>
-      </w:r>
-    </w:p>
-    <w:p>
-      <w:pPr>
-        <w:pStyle w:val="CodeBlock"/>
-        <w:keepLines/>
-        <w:shd w:fill="F3F3F3"/>
-      </w:pPr>
-      <w:r>
-        <w:rPr>
-          <w:rFonts w:ascii="DejaVu Sans Mono" w:hAnsi="DejaVu Sans Mono" w:eastAsia="DejaVu Sans Mono" w:cs="DejaVu Sans Mono"/>
-          <w:color w:val="000000"/>
-        </w:rPr>
-        <w:t>php jeep backup:clean --keep=7</w:t>
-      </w:r>
-    </w:p>
-    <w:p>
-      <w:pPr>
-        <w:pStyle w:val="CodeBlock"/>
-        <w:keepLines/>
-        <w:shd w:fill="F3F3F3"/>
-      </w:pPr>
-      <w:r>
-        <w:rPr>
-          <w:rFonts w:ascii="DejaVu Sans Mono" w:hAnsi="DejaVu Sans Mono" w:eastAsia="DejaVu Sans Mono" w:cs="DejaVu Sans Mono"/>
-          <w:color w:val="000000"/>
-        </w:rPr>
-        <w:t>php jeep backup:clean --keep=7 --drive</w:t>
-      </w:r>
-    </w:p>
-    <w:p>
-      <w:pPr>
-        <w:pStyle w:val="CodeBlock"/>
-        <w:keepLines/>
-        <w:shd w:fill="F3F3F3"/>
-      </w:pPr>
-      <w:r>
-        <w:rPr>
-          <w:rFonts w:ascii="DejaVu Sans Mono" w:hAnsi="DejaVu Sans Mono" w:eastAsia="DejaVu Sans Mono" w:cs="DejaVu Sans Mono"/>
-          <w:color w:val="000000"/>
-        </w:rPr>
-        <w:t>php jeep drive:disconnect</w:t>
+        <w:t>php artisan backup:restore BACKUP_FILE.sql.gz.enc --force</w:t>
+      </w:r>
+    </w:p>
+    <w:p>
+      <w:pPr>
+        <w:pStyle w:val="CodeBlock"/>
+        <w:keepLines/>
+        <w:shd w:fill="F3F3F3"/>
+      </w:pPr>
+      <w:r>
+        <w:rPr>
+          <w:rFonts w:ascii="DejaVu Sans Mono" w:hAnsi="DejaVu Sans Mono" w:eastAsia="DejaVu Sans Mono" w:cs="DejaVu Sans Mono"/>
+          <w:color w:val="000000"/>
+        </w:rPr>
+        <w:t>php artisan backup:restore --drive DRIVE_FILE_ID --force</w:t>
+      </w:r>
+    </w:p>
+    <w:p>
+      <w:pPr>
+        <w:pStyle w:val="CodeBlock"/>
+        <w:keepLines/>
+        <w:shd w:fill="F3F3F3"/>
+      </w:pPr>
+      <w:r>
+        <w:rPr>
+          <w:rFonts w:ascii="DejaVu Sans Mono" w:hAnsi="DejaVu Sans Mono" w:eastAsia="DejaVu Sans Mono" w:cs="DejaVu Sans Mono"/>
+          <w:color w:val="000000"/>
+        </w:rPr>
+        <w:t>php artisan backup:clean --keep=7</w:t>
+      </w:r>
+    </w:p>
+    <w:p>
+      <w:pPr>
+        <w:pStyle w:val="CodeBlock"/>
+        <w:keepLines/>
+        <w:shd w:fill="F3F3F3"/>
+      </w:pPr>
+      <w:r>
+        <w:rPr>
+          <w:rFonts w:ascii="DejaVu Sans Mono" w:hAnsi="DejaVu Sans Mono" w:eastAsia="DejaVu Sans Mono" w:cs="DejaVu Sans Mono"/>
+          <w:color w:val="000000"/>
+        </w:rPr>
+        <w:t>php artisan backup:clean --keep=7 --drive</w:t>
+      </w:r>
+    </w:p>
+    <w:p>
+      <w:pPr>
+        <w:pStyle w:val="CodeBlock"/>
+        <w:keepLines/>
+        <w:shd w:fill="F3F3F3"/>
+      </w:pPr>
+      <w:r>
+        <w:rPr>
+          <w:rFonts w:ascii="DejaVu Sans Mono" w:hAnsi="DejaVu Sans Mono" w:eastAsia="DejaVu Sans Mono" w:cs="DejaVu Sans Mono"/>
+          <w:color w:val="000000"/>
+        </w:rPr>
+        <w:t>php artisan drive:disconnect</w:t>
       </w:r>
     </w:p>
     <w:p>
@@ -8435,16 +8482,15 @@
           <w:rFonts w:ascii="DejaVu Sans Mono" w:hAnsi="DejaVu Sans Mono" w:eastAsia="DejaVu Sans Mono" w:cs="DejaVu Sans Mono"/>
           <w:color w:val="000000"/>
         </w:rPr>
-        <w:t>Check that the Drive API is enabled, the OAuth JSON is for a Desktop app, the Google user can approve access, and PHP cURL/OpenSSL are enabled. Re-run `php jeep drive:connect path/to/oauth-client.json`. A missing or incorrect encryption key blocks encrypted backup and restore. If remote revocation cannot be confirmed, revoke JeePHP from Google Account security settings.</w:t>
-      </w:r>
-    </w:p>
-    <w:p>
-      <w:r>
-        <w:rPr>
-          <w:rFonts w:ascii="DejaVu Sans Mono" w:hAnsi="DejaVu Sans Mono" w:eastAsia="DejaVu Sans Mono" w:cs="DejaVu Sans Mono"/>
-          <w:color w:val="000000"/>
-        </w:rPr>
-        <w:br w:type="page"/>
+        <w:t>Check that the Drive API is enabled, the OAuth JSON is for a Desktop app, the Google user can approve access, and PHP cURL/OpenSSL are enabled. Re-run `php artisan drive:connect path/to/oauth-client.json`. A missing or incorrect encryption key blocks encrypted backup and restore. If remote revocation cannot be confirmed, revoke JeePHP from Google Account security settings.</w:t>
+      </w:r>
+    </w:p>
+    <w:p>
+      <w:r>
+        <w:rPr>
+          <w:rFonts w:ascii="DejaVu Sans Mono" w:hAnsi="DejaVu Sans Mono" w:eastAsia="DejaVu Sans Mono" w:cs="DejaVu Sans Mono"/>
+          <w:color w:val="000000"/>
+        </w:rPr>
       </w:r>
     </w:p>
     <w:p>
@@ -8470,212 +8516,212 @@
           <w:rFonts w:ascii="DejaVu Sans Mono" w:hAnsi="DejaVu Sans Mono" w:eastAsia="DejaVu Sans Mono" w:cs="DejaVu Sans Mono"/>
           <w:color w:val="000000"/>
         </w:rPr>
-        <w:t>php jeep --version</w:t>
-      </w:r>
-    </w:p>
-    <w:p>
-      <w:pPr>
-        <w:pStyle w:val="CodeBlock"/>
-        <w:keepLines/>
-        <w:shd w:fill="F3F3F3"/>
-      </w:pPr>
-      <w:r>
-        <w:rPr>
-          <w:rFonts w:ascii="DejaVu Sans Mono" w:hAnsi="DejaVu Sans Mono" w:eastAsia="DejaVu Sans Mono" w:cs="DejaVu Sans Mono"/>
-          <w:color w:val="000000"/>
-        </w:rPr>
-        <w:t>php jeep serve</w:t>
-      </w:r>
-    </w:p>
-    <w:p>
-      <w:pPr>
-        <w:pStyle w:val="CodeBlock"/>
-        <w:keepLines/>
-        <w:shd w:fill="F3F3F3"/>
-      </w:pPr>
-      <w:r>
-        <w:rPr>
-          <w:rFonts w:ascii="DejaVu Sans Mono" w:hAnsi="DejaVu Sans Mono" w:eastAsia="DejaVu Sans Mono" w:cs="DejaVu Sans Mono"/>
-          <w:color w:val="000000"/>
-        </w:rPr>
-        <w:t>php jeep migrate</w:t>
-      </w:r>
-    </w:p>
-    <w:p>
-      <w:pPr>
-        <w:pStyle w:val="CodeBlock"/>
-        <w:keepLines/>
-        <w:shd w:fill="F3F3F3"/>
-      </w:pPr>
-      <w:r>
-        <w:rPr>
-          <w:rFonts w:ascii="DejaVu Sans Mono" w:hAnsi="DejaVu Sans Mono" w:eastAsia="DejaVu Sans Mono" w:cs="DejaVu Sans Mono"/>
-          <w:color w:val="000000"/>
-        </w:rPr>
-        <w:t>php jeep package:list</w:t>
-      </w:r>
-    </w:p>
-    <w:p>
-      <w:pPr>
-        <w:pStyle w:val="CodeBlock"/>
-        <w:keepLines/>
-        <w:shd w:fill="F3F3F3"/>
-      </w:pPr>
-      <w:r>
-        <w:rPr>
-          <w:rFonts w:ascii="DejaVu Sans Mono" w:hAnsi="DejaVu Sans Mono" w:eastAsia="DejaVu Sans Mono" w:cs="DejaVu Sans Mono"/>
-          <w:color w:val="000000"/>
-        </w:rPr>
-        <w:t>php jeep activate AuthO</w:t>
-      </w:r>
-    </w:p>
-    <w:p>
-      <w:pPr>
-        <w:pStyle w:val="CodeBlock"/>
-        <w:keepLines/>
-        <w:shd w:fill="F3F3F3"/>
-      </w:pPr>
-      <w:r>
-        <w:rPr>
-          <w:rFonts w:ascii="DejaVu Sans Mono" w:hAnsi="DejaVu Sans Mono" w:eastAsia="DejaVu Sans Mono" w:cs="DejaVu Sans Mono"/>
-          <w:color w:val="000000"/>
-        </w:rPr>
-        <w:t>php jeep activate RolesO</w:t>
-      </w:r>
-    </w:p>
-    <w:p>
-      <w:pPr>
-        <w:pStyle w:val="CodeBlock"/>
-        <w:keepLines/>
-        <w:shd w:fill="F3F3F3"/>
-      </w:pPr>
-      <w:r>
-        <w:rPr>
-          <w:rFonts w:ascii="DejaVu Sans Mono" w:hAnsi="DejaVu Sans Mono" w:eastAsia="DejaVu Sans Mono" w:cs="DejaVu Sans Mono"/>
-          <w:color w:val="000000"/>
-        </w:rPr>
-        <w:t>php jeep activate BackupO</w:t>
-      </w:r>
-    </w:p>
-    <w:p>
-      <w:pPr>
-        <w:pStyle w:val="CodeBlock"/>
-        <w:keepLines/>
-        <w:shd w:fill="F3F3F3"/>
-      </w:pPr>
-      <w:r>
-        <w:rPr>
-          <w:rFonts w:ascii="DejaVu Sans Mono" w:hAnsi="DejaVu Sans Mono" w:eastAsia="DejaVu Sans Mono" w:cs="DejaVu Sans Mono"/>
-          <w:color w:val="000000"/>
-        </w:rPr>
-        <w:t>php jeep backup:key-generate</w:t>
-      </w:r>
-    </w:p>
-    <w:p>
-      <w:pPr>
-        <w:pStyle w:val="CodeBlock"/>
-        <w:keepLines/>
-        <w:shd w:fill="F3F3F3"/>
-      </w:pPr>
-      <w:r>
-        <w:rPr>
-          <w:rFonts w:ascii="DejaVu Sans Mono" w:hAnsi="DejaVu Sans Mono" w:eastAsia="DejaVu Sans Mono" w:cs="DejaVu Sans Mono"/>
-          <w:color w:val="000000"/>
-        </w:rPr>
-        <w:t>php jeep drive:connect oauth-client.json</w:t>
-      </w:r>
-    </w:p>
-    <w:p>
-      <w:pPr>
-        <w:pStyle w:val="CodeBlock"/>
-        <w:keepLines/>
-        <w:shd w:fill="F3F3F3"/>
-      </w:pPr>
-      <w:r>
-        <w:rPr>
-          <w:rFonts w:ascii="DejaVu Sans Mono" w:hAnsi="DejaVu Sans Mono" w:eastAsia="DejaVu Sans Mono" w:cs="DejaVu Sans Mono"/>
-          <w:color w:val="000000"/>
-        </w:rPr>
-        <w:t>php jeep backup:database --drive</w:t>
-      </w:r>
-    </w:p>
-    <w:p>
-      <w:pPr>
-        <w:pStyle w:val="CodeBlock"/>
-        <w:keepLines/>
-        <w:shd w:fill="F3F3F3"/>
-      </w:pPr>
-      <w:r>
-        <w:rPr>
-          <w:rFonts w:ascii="DejaVu Sans Mono" w:hAnsi="DejaVu Sans Mono" w:eastAsia="DejaVu Sans Mono" w:cs="DejaVu Sans Mono"/>
-          <w:color w:val="000000"/>
-        </w:rPr>
-        <w:t>php jeep backup:list --drive</w:t>
-      </w:r>
-    </w:p>
-    <w:p>
-      <w:pPr>
-        <w:pStyle w:val="CodeBlock"/>
-        <w:keepLines/>
-        <w:shd w:fill="F3F3F3"/>
-      </w:pPr>
-      <w:r>
-        <w:rPr>
-          <w:rFonts w:ascii="DejaVu Sans Mono" w:hAnsi="DejaVu Sans Mono" w:eastAsia="DejaVu Sans Mono" w:cs="DejaVu Sans Mono"/>
-          <w:color w:val="000000"/>
-        </w:rPr>
-        <w:t>php jeep backup:restore --drive FILE_ID --force</w:t>
-      </w:r>
-    </w:p>
-    <w:p>
-      <w:pPr>
-        <w:pStyle w:val="CodeBlock"/>
-        <w:keepLines/>
-        <w:shd w:fill="F3F3F3"/>
-      </w:pPr>
-      <w:r>
-        <w:rPr>
-          <w:rFonts w:ascii="DejaVu Sans Mono" w:hAnsi="DejaVu Sans Mono" w:eastAsia="DejaVu Sans Mono" w:cs="DejaVu Sans Mono"/>
-          <w:color w:val="000000"/>
-        </w:rPr>
-        <w:t>php jeep backup:clean --keep=7 --drive</w:t>
-      </w:r>
-    </w:p>
-    <w:p>
-      <w:pPr>
-        <w:pStyle w:val="CodeBlock"/>
-        <w:keepLines/>
-        <w:shd w:fill="F3F3F3"/>
-      </w:pPr>
-      <w:r>
-        <w:rPr>
-          <w:rFonts w:ascii="DejaVu Sans Mono" w:hAnsi="DejaVu Sans Mono" w:eastAsia="DejaVu Sans Mono" w:cs="DejaVu Sans Mono"/>
-          <w:color w:val="000000"/>
-        </w:rPr>
-        <w:t>php jeep role:assign USER_ID admin</w:t>
-      </w:r>
-    </w:p>
-    <w:p>
-      <w:pPr>
-        <w:pStyle w:val="CodeBlock"/>
-        <w:keepLines/>
-        <w:shd w:fill="F3F3F3"/>
-      </w:pPr>
-      <w:r>
-        <w:rPr>
-          <w:rFonts w:ascii="DejaVu Sans Mono" w:hAnsi="DejaVu Sans Mono" w:eastAsia="DejaVu Sans Mono" w:cs="DejaVu Sans Mono"/>
-          <w:color w:val="000000"/>
-        </w:rPr>
-        <w:t>php jeep permission:grant admin roles.manage</w:t>
-      </w:r>
-    </w:p>
-    <w:p>
-      <w:r>
-        <w:rPr>
-          <w:rFonts w:ascii="DejaVu Sans Mono" w:hAnsi="DejaVu Sans Mono" w:eastAsia="DejaVu Sans Mono" w:cs="DejaVu Sans Mono"/>
-          <w:color w:val="000000"/>
-        </w:rPr>
-        <w:t>Windows command alternatives: use `jeep.bat` in place of `php jeep` when PHP is available on PATH.</w:t>
+        <w:t>php artisan --version</w:t>
+      </w:r>
+    </w:p>
+    <w:p>
+      <w:pPr>
+        <w:pStyle w:val="CodeBlock"/>
+        <w:keepLines/>
+        <w:shd w:fill="F3F3F3"/>
+      </w:pPr>
+      <w:r>
+        <w:rPr>
+          <w:rFonts w:ascii="DejaVu Sans Mono" w:hAnsi="DejaVu Sans Mono" w:eastAsia="DejaVu Sans Mono" w:cs="DejaVu Sans Mono"/>
+          <w:color w:val="000000"/>
+        </w:rPr>
+        <w:t>php artisan serve</w:t>
+      </w:r>
+    </w:p>
+    <w:p>
+      <w:pPr>
+        <w:pStyle w:val="CodeBlock"/>
+        <w:keepLines/>
+        <w:shd w:fill="F3F3F3"/>
+      </w:pPr>
+      <w:r>
+        <w:rPr>
+          <w:rFonts w:ascii="DejaVu Sans Mono" w:hAnsi="DejaVu Sans Mono" w:eastAsia="DejaVu Sans Mono" w:cs="DejaVu Sans Mono"/>
+          <w:color w:val="000000"/>
+        </w:rPr>
+        <w:t>php artisan migrate</w:t>
+      </w:r>
+    </w:p>
+    <w:p>
+      <w:pPr>
+        <w:pStyle w:val="CodeBlock"/>
+        <w:keepLines/>
+        <w:shd w:fill="F3F3F3"/>
+      </w:pPr>
+      <w:r>
+        <w:rPr>
+          <w:rFonts w:ascii="DejaVu Sans Mono" w:hAnsi="DejaVu Sans Mono" w:eastAsia="DejaVu Sans Mono" w:cs="DejaVu Sans Mono"/>
+          <w:color w:val="000000"/>
+        </w:rPr>
+        <w:t>php artisan package:list</w:t>
+      </w:r>
+    </w:p>
+    <w:p>
+      <w:pPr>
+        <w:pStyle w:val="CodeBlock"/>
+        <w:keepLines/>
+        <w:shd w:fill="F3F3F3"/>
+      </w:pPr>
+      <w:r>
+        <w:rPr>
+          <w:rFonts w:ascii="DejaVu Sans Mono" w:hAnsi="DejaVu Sans Mono" w:eastAsia="DejaVu Sans Mono" w:cs="DejaVu Sans Mono"/>
+          <w:color w:val="000000"/>
+        </w:rPr>
+        <w:t>php artisan activate AuthO</w:t>
+      </w:r>
+    </w:p>
+    <w:p>
+      <w:pPr>
+        <w:pStyle w:val="CodeBlock"/>
+        <w:keepLines/>
+        <w:shd w:fill="F3F3F3"/>
+      </w:pPr>
+      <w:r>
+        <w:rPr>
+          <w:rFonts w:ascii="DejaVu Sans Mono" w:hAnsi="DejaVu Sans Mono" w:eastAsia="DejaVu Sans Mono" w:cs="DejaVu Sans Mono"/>
+          <w:color w:val="000000"/>
+        </w:rPr>
+        <w:t>php artisan activate RolesO</w:t>
+      </w:r>
+    </w:p>
+    <w:p>
+      <w:pPr>
+        <w:pStyle w:val="CodeBlock"/>
+        <w:keepLines/>
+        <w:shd w:fill="F3F3F3"/>
+      </w:pPr>
+      <w:r>
+        <w:rPr>
+          <w:rFonts w:ascii="DejaVu Sans Mono" w:hAnsi="DejaVu Sans Mono" w:eastAsia="DejaVu Sans Mono" w:cs="DejaVu Sans Mono"/>
+          <w:color w:val="000000"/>
+        </w:rPr>
+        <w:t>php artisan activate BackupO</w:t>
+      </w:r>
+    </w:p>
+    <w:p>
+      <w:pPr>
+        <w:pStyle w:val="CodeBlock"/>
+        <w:keepLines/>
+        <w:shd w:fill="F3F3F3"/>
+      </w:pPr>
+      <w:r>
+        <w:rPr>
+          <w:rFonts w:ascii="DejaVu Sans Mono" w:hAnsi="DejaVu Sans Mono" w:eastAsia="DejaVu Sans Mono" w:cs="DejaVu Sans Mono"/>
+          <w:color w:val="000000"/>
+        </w:rPr>
+        <w:t>php artisan backup:key-generate</w:t>
+      </w:r>
+    </w:p>
+    <w:p>
+      <w:pPr>
+        <w:pStyle w:val="CodeBlock"/>
+        <w:keepLines/>
+        <w:shd w:fill="F3F3F3"/>
+      </w:pPr>
+      <w:r>
+        <w:rPr>
+          <w:rFonts w:ascii="DejaVu Sans Mono" w:hAnsi="DejaVu Sans Mono" w:eastAsia="DejaVu Sans Mono" w:cs="DejaVu Sans Mono"/>
+          <w:color w:val="000000"/>
+        </w:rPr>
+        <w:t>php artisan drive:connect oauth-client.json</w:t>
+      </w:r>
+    </w:p>
+    <w:p>
+      <w:pPr>
+        <w:pStyle w:val="CodeBlock"/>
+        <w:keepLines/>
+        <w:shd w:fill="F3F3F3"/>
+      </w:pPr>
+      <w:r>
+        <w:rPr>
+          <w:rFonts w:ascii="DejaVu Sans Mono" w:hAnsi="DejaVu Sans Mono" w:eastAsia="DejaVu Sans Mono" w:cs="DejaVu Sans Mono"/>
+          <w:color w:val="000000"/>
+        </w:rPr>
+        <w:t>php artisan backup:database --drive</w:t>
+      </w:r>
+    </w:p>
+    <w:p>
+      <w:pPr>
+        <w:pStyle w:val="CodeBlock"/>
+        <w:keepLines/>
+        <w:shd w:fill="F3F3F3"/>
+      </w:pPr>
+      <w:r>
+        <w:rPr>
+          <w:rFonts w:ascii="DejaVu Sans Mono" w:hAnsi="DejaVu Sans Mono" w:eastAsia="DejaVu Sans Mono" w:cs="DejaVu Sans Mono"/>
+          <w:color w:val="000000"/>
+        </w:rPr>
+        <w:t>php artisan backup:list --drive</w:t>
+      </w:r>
+    </w:p>
+    <w:p>
+      <w:pPr>
+        <w:pStyle w:val="CodeBlock"/>
+        <w:keepLines/>
+        <w:shd w:fill="F3F3F3"/>
+      </w:pPr>
+      <w:r>
+        <w:rPr>
+          <w:rFonts w:ascii="DejaVu Sans Mono" w:hAnsi="DejaVu Sans Mono" w:eastAsia="DejaVu Sans Mono" w:cs="DejaVu Sans Mono"/>
+          <w:color w:val="000000"/>
+        </w:rPr>
+        <w:t>php artisan backup:restore --drive FILE_ID --force</w:t>
+      </w:r>
+    </w:p>
+    <w:p>
+      <w:pPr>
+        <w:pStyle w:val="CodeBlock"/>
+        <w:keepLines/>
+        <w:shd w:fill="F3F3F3"/>
+      </w:pPr>
+      <w:r>
+        <w:rPr>
+          <w:rFonts w:ascii="DejaVu Sans Mono" w:hAnsi="DejaVu Sans Mono" w:eastAsia="DejaVu Sans Mono" w:cs="DejaVu Sans Mono"/>
+          <w:color w:val="000000"/>
+        </w:rPr>
+        <w:t>php artisan backup:clean --keep=7 --drive</w:t>
+      </w:r>
+    </w:p>
+    <w:p>
+      <w:pPr>
+        <w:pStyle w:val="CodeBlock"/>
+        <w:keepLines/>
+        <w:shd w:fill="F3F3F3"/>
+      </w:pPr>
+      <w:r>
+        <w:rPr>
+          <w:rFonts w:ascii="DejaVu Sans Mono" w:hAnsi="DejaVu Sans Mono" w:eastAsia="DejaVu Sans Mono" w:cs="DejaVu Sans Mono"/>
+          <w:color w:val="000000"/>
+        </w:rPr>
+        <w:t>php artisan role:assign USER_ID admin</w:t>
+      </w:r>
+    </w:p>
+    <w:p>
+      <w:pPr>
+        <w:pStyle w:val="CodeBlock"/>
+        <w:keepLines/>
+        <w:shd w:fill="F3F3F3"/>
+      </w:pPr>
+      <w:r>
+        <w:rPr>
+          <w:rFonts w:ascii="DejaVu Sans Mono" w:hAnsi="DejaVu Sans Mono" w:eastAsia="DejaVu Sans Mono" w:cs="DejaVu Sans Mono"/>
+          <w:color w:val="000000"/>
+        </w:rPr>
+        <w:t>php artisan permission:grant admin roles.manage</w:t>
+      </w:r>
+    </w:p>
+    <w:p>
+      <w:r>
+        <w:rPr>
+          <w:rFonts w:ascii="DejaVu Sans Mono" w:hAnsi="DejaVu Sans Mono" w:eastAsia="DejaVu Sans Mono" w:cs="DejaVu Sans Mono"/>
+          <w:color w:val="000000"/>
+        </w:rPr>
+        <w:t>Windows command alternatives: use artisan.bat instead of php artisan when PHP is available on PATH. The earlier php jeep and jeep.bat launchers remain supported.</w:t>
       </w:r>
     </w:p>
     <w:sectPr>

</xml_diff>

<commit_message>
Add JeePHP security release candidate
</commit_message>
<xml_diff>
--- a/docs/JeePHP-Manual-Book-v1.0.0.docx
+++ b/docs/JeePHP-Manual-Book-v1.0.0.docx
@@ -54,7 +54,7 @@
           <w:color w:val="000000"/>
           <w:sz w:val="20"/>
         </w:rPr>
-        <w:t>VERSION 1.0.0  /  BLACK + WHITE  /  PHP 8.1+</w:t>
+        <w:t>VERSION 1.0.0  /  PATCHED PHP 8.2.35+ / 8.3.36+ / 8.4.27+ / 8.5.12+</w:t>
       </w:r>
     </w:p>
     <w:p>
@@ -83,7 +83,7 @@
           <w:color w:val="000000"/>
           <w:sz w:val="16"/>
         </w:rPr>
-        <w:t>A practical manual based on the JeePHP source snapshot dated 21 October 2026.</w:t>
+        <w:t>A practical manual based on the JeePHP source snapshot dated 22 October 2026.</w:t>
       </w:r>
     </w:p>
     <w:p>
@@ -121,7 +121,7 @@
           <w:rFonts w:ascii="DejaVu Sans Mono" w:hAnsi="DejaVu Sans Mono" w:eastAsia="DejaVu Sans Mono" w:cs="DejaVu Sans Mono"/>
           <w:color w:val="000000"/>
         </w:rPr>
-        <w:t>JeePHP is still evolving. The PHP code and commands in this manual are based on the source files available on 21 October 2026. A feature reaches Composer/Packagist only after its source is pushed, tagged, and published. Check the installed package version before expecting a new command to exist.</w:t>
+        <w:t>JeePHP is still evolving. The PHP code and commands in this manual are based on the source files available on 22 October 2026. A feature reaches Composer/Packagist only after its source is pushed, tagged, and published. Check the installed package version before expecting a new command to exist.</w:t>
       </w:r>
     </w:p>
     <w:p>
@@ -569,7 +569,7 @@
           <w:rFonts w:ascii="DejaVu Sans Mono" w:hAnsi="DejaVu Sans Mono" w:eastAsia="DejaVu Sans Mono" w:cs="DejaVu Sans Mono"/>
           <w:color w:val="000000"/>
         </w:rPr>
-        <w:t>PHP 8.1 or later on the command line.</w:t>
+        <w:t>Patched PHP 8.2.35+, 8.3.36+, 8.4.27+, or 8.5.12+ on its matching branch, for both CLI and the web server.</w:t>
       </w:r>
     </w:p>
     <w:p>
@@ -7571,7 +7571,7 @@
           <w:rFonts w:ascii="DejaVu Sans Mono" w:hAnsi="DejaVu Sans Mono" w:eastAsia="DejaVu Sans Mono" w:cs="DejaVu Sans Mono"/>
           <w:color w:val="000000"/>
         </w:rPr>
-        <w:t>Run `php -v` and check the PHP executable Composer is using. JeePHP source requires PHP 8.1 or later. If using XAMPP on Windows, make sure Composer is configured to use the intended XAMPP PHP executable.</w:t>
+        <w:t>Run `php -v` and check the PHP executable Composer is using. JeePHP source requires patched PHP 8.2.35+, 8.3.36+, 8.4.27+, or 8.5.12+ on its matching branch. If using XAMPP on Windows, make sure Composer is configured to use the intended XAMPP PHP executable.</w:t>
       </w:r>
     </w:p>
     <w:p>
@@ -8722,6 +8722,181 @@
           <w:color w:val="000000"/>
         </w:rPr>
         <w:t>Windows command alternatives: use artisan.bat instead of php artisan when PHP is available on PATH. The earlier php jeep and jeep.bat launchers remain supported.</w:t>
+      </w:r>
+    </w:p>
+    <w:p>
+      <w:pPr>
+        <w:pStyle w:val="Heading1"/>
+        <w:pageBreakBefore/>
+      </w:pPr>
+      <w:r>
+        <w:t>Appendix  Framework audit update</w:t>
+      </w:r>
+    </w:p>
+    <w:p>
+      <w:r>
+        <w:t>Updated 22 October 2026. JeePHP keeps application code short while the framework handles request parsing, query limits, validation, and session token checks. The source version remains 1.0.0.</w:t>
+      </w:r>
+    </w:p>
+    <w:p>
+      <w:pPr>
+        <w:pStyle w:val="Heading2"/>
+      </w:pPr>
+      <w:r>
+        <w:t>One line DataTables response</w:t>
+      </w:r>
+    </w:p>
+    <w:p>
+      <w:pPr>
+        <w:pStyle w:val="CodeBlock"/>
+      </w:pPr>
+      <w:r>
+        <w:t>return table_ajax('customers', 'id', 'name', 'email');</w:t>
+      </w:r>
+    </w:p>
+    <w:p>
+      <w:r>
+        <w:t>Put the line inside a controller action returning string and connect a GET route. For filtered tables, use json_data(table_load('customers')-&gt;where('status', 'active')-&gt;columns('id', 'name')-&gt;ajax()). Older ajax($request) calls remain supported. The response caps page length at 500 and never trusts a browser supplied SQL column name.</w:t>
+      </w:r>
+    </w:p>
+    <w:p>
+      <w:pPr>
+        <w:pStyle w:val="Heading2"/>
+      </w:pPr>
+      <w:r>
+        <w:t>JSON requests and form safety</w:t>
+      </w:r>
+    </w:p>
+    <w:p>
+      <w:r>
+        <w:t>For Content-Type application/json, $request-&gt;input('name') reads a JSON object body. An invalid or non-object body returns HTTP 400. Browser POST forms include &lt;?= safe_form() ?&gt;; JavaScript POST requests send X-CSRF-TOKEN. API endpoints using bearer authentication still check each action with api_require('ability').</w:t>
+      </w:r>
+    </w:p>
+    <w:p>
+      <w:pPr>
+        <w:pStyle w:val="Heading2"/>
+      </w:pPr>
+      <w:r>
+        <w:t>AuthO and generated CRUD fixes</w:t>
+      </w:r>
+    </w:p>
+    <w:p>
+      <w:r>
+        <w:t>New AuthO activations register POST /auth/register and POST /auth/login so those forms can submit. Existing active projects keep their copied routes: add those two POST routes manually in routes/web.php. The CRUD generator now escapes prefilled values once and rejects array values during validation.</w:t>
+      </w:r>
+    </w:p>
+    <w:p>
+      <w:pPr>
+        <w:pStyle w:val="Heading2"/>
+      </w:pPr>
+      <w:r>
+        <w:t>Apache and verification</w:t>
+      </w:r>
+    </w:p>
+    <w:p>
+      <w:r>
+        <w:t>Private source folders now contain deny rules even if mod_rewrite is unavailable, provided Apache honors .htaccess. Clean URLs still require mod_rewrite, and a production server must point DocumentRoot at public/. Run composer validate, composer install, php artisan test, and php artisan serve on patched PHP; then test database and Apache integration on the target system.</w:t>
+      </w:r>
+    </w:p>
+    <w:p>
+      <w:r/>
+    </w:p>
+    <w:p>
+      <w:pPr>
+        <w:pStyle w:val="Heading1"/>
+        <w:pageBreakBefore/>
+      </w:pPr>
+      <w:r>
+        <w:t>Appendix  Security release update</w:t>
+      </w:r>
+    </w:p>
+    <w:p>
+      <w:r>
+        <w:t>Updated 22 October 2026. JeePHP now blocks older PHP runtimes at Composer installation and application bootstrap. A PHP engine attack can happen before JeePHP starts, so the server itself must run an official patched PHP release. The minimum releases are PHP 8.2.35, 8.3.36, 8.4.27, or 8.5.12 on their respective branches. PHP 8.1 is unsupported; PHP 8.2 support ends 31 December 2026. Install future security updates as they arrive.</w:t>
+      </w:r>
+    </w:p>
+    <w:p>
+      <w:pPr>
+        <w:pStyle w:val="Heading2"/>
+      </w:pPr>
+      <w:r>
+        <w:t>Verify CLI and web server separately</w:t>
+      </w:r>
+    </w:p>
+    <w:p>
+      <w:r>
+        <w:t>Run these commands in the project folder on the patched PHP binary. The diagnostic checks CLI only; verify the Apache or FPM PHP runtime separately on the target host, especially when Composer and XAMPP use different PHP installations. Do not bypass Composer platform requirements.</w:t>
+      </w:r>
+    </w:p>
+    <w:p>
+      <w:pPr>
+        <w:pStyle w:val="CodeBlock"/>
+      </w:pPr>
+      <w:r>
+        <w:t>php -v</w:t>
+      </w:r>
+    </w:p>
+    <w:p>
+      <w:pPr>
+        <w:pStyle w:val="CodeBlock"/>
+      </w:pPr>
+      <w:r>
+        <w:t>php artisan security:check</w:t>
+      </w:r>
+    </w:p>
+    <w:p>
+      <w:pPr>
+        <w:pStyle w:val="CodeBlock"/>
+      </w:pPr>
+      <w:r>
+        <w:t>composer validate</w:t>
+      </w:r>
+    </w:p>
+    <w:p>
+      <w:pPr>
+        <w:pStyle w:val="CodeBlock"/>
+      </w:pPr>
+      <w:r>
+        <w:t>composer install</w:t>
+      </w:r>
+    </w:p>
+    <w:p>
+      <w:pPr>
+        <w:pStyle w:val="CodeBlock"/>
+      </w:pPr>
+      <w:r>
+        <w:t>php artisan test</w:t>
+      </w:r>
+    </w:p>
+    <w:p>
+      <w:pPr>
+        <w:pStyle w:val="Heading2"/>
+      </w:pPr>
+      <w:r>
+        <w:t>Application protections</w:t>
+      </w:r>
+    </w:p>
+    <w:p>
+      <w:r>
+        <w:t>Session cookies now use a project-scoped name and URL subfolder path. A trusted HTTPS APP_URL keeps the Secure cookie flag when TLS ends at a reverse proxy. Session startup and rotation fail closed. After updating an existing site, clear old session cookies and ask users to sign in again.</w:t>
+      </w:r>
+    </w:p>
+    <w:p>
+      <w:r>
+        <w:t>APIO api_require('users.read') now ends denied requests with JSON 401 or 403 before controller code can continue. Previously activated APIO projects must merge packages/APIO/files/helpers.php into app/Helpers/helpers.php because package activation never overwrites installed helpers. Check record ownership in each controller; an API ability alone is not a per-record authorization policy. Generated CRUD routes are public until the developer adds suitable authentication and authorization.</w:t>
+      </w:r>
+    </w:p>
+    <w:p>
+      <w:pPr>
+        <w:pStyle w:val="Heading2"/>
+      </w:pPr>
+      <w:r>
+        <w:t>Release gate</w:t>
+      </w:r>
+    </w:p>
+    <w:p>
+      <w:r>
+        <w:t>Before production, point DocumentRoot at public/, use HTTPS, APP_ENV=production, APP_DEBUG=false, and an HTTPS APP_URL. Keep .duck, credentials, dumps, and storage outside the public path. Test AuthO, RolesO, CRUD create/edit, CSRF rejection, API 401/403, HTTPS cookies, uploads, and backup restore against a real MySQL and Apache/FPM staging deployment. Run a dependency audit and independent security review. No production certification follows from source checks alone. See SECURITY-RELEASE.md for the full checklist and official PHP references.</w:t>
       </w:r>
     </w:p>
     <w:sectPr>
@@ -8749,7 +8924,7 @@
         <w:color w:val="000000"/>
         <w:sz w:val="16"/>
       </w:rPr>
-      <w:t xml:space="preserve">JeePHP  |  Source API snapshot 21 October 2026  |  </w:t>
+      <w:t xml:space="preserve">JeePHP  |  Source API snapshot 22 October 2026  |  </w:t>
     </w:r>
     <w:fldSimple w:instr="PAGE"/>
   </w:p>

</xml_diff>

<commit_message>
Secure AuthO rate limits and record ownership
</commit_message>
<xml_diff>
--- a/docs/JeePHP-Manual-Book-v1.0.0.docx
+++ b/docs/JeePHP-Manual-Book-v1.0.0.docx
@@ -8897,6 +8897,80 @@
     <w:p>
       <w:r>
         <w:t>Before production, point DocumentRoot at public/, use HTTPS, APP_ENV=production, APP_DEBUG=false, and an HTTPS APP_URL. Keep .duck, credentials, dumps, and storage outside the public path. Test AuthO, RolesO, CRUD create/edit, CSRF rejection, API 401/403, HTTPS cookies, uploads, and backup restore against a real MySQL and Apache/FPM staging deployment. Run a dependency audit and independent security review. No production certification follows from source checks alone. See SECURITY-RELEASE.md for the full checklist and official PHP references.</w:t>
+      </w:r>
+    </w:p>
+    <w:p>
+      <w:pPr>
+        <w:pStyle w:val="Heading1"/>
+        <w:pageBreakBefore/>
+      </w:pPr>
+      <w:r>
+        <w:t>Appendix  AuthO security update</w:t>
+      </w:r>
+    </w:p>
+    <w:p>
+      <w:r>
+        <w:t>Updated 22 October 2026. AuthO now counts login, registration, and password-reset attempts in a MySQL table shared by PHP workers and browser sessions. Clearing cookies or opening a fresh session no longer resets the limit. The old account-wide lockout check has been removed so bad passwords from another IP cannot lock a victim account out. The controller continues to verify passwords with password_verify and rotate the session after sign-in.</w:t>
+      </w:r>
+    </w:p>
+    <w:p>
+      <w:pPr>
+        <w:pStyle w:val="Heading2"/>
+      </w:pPr>
+      <w:r>
+        <w:t>Limits and ownership</w:t>
+      </w:r>
+    </w:p>
+    <w:p>
+      <w:r>
+        <w:t>Login accepts 30 requests per server-observed IP per 15 minutes and 5 requests per IP/email pair per 15 minutes. Registration accepts 10 requests per IP per hour and password-reset requests accept 5 per IP per hour. Further attempts return HTTP 429. A missing MySQL database stops AuthO traffic instead of silently allowing unlimited attempts. Distributed attackers using many IPs and reverse proxies that hide client addresses still need trusted-edge limits and monitoring.</w:t>
+      </w:r>
+    </w:p>
+    <w:p>
+      <w:r>
+        <w:t>For a protected booking, fetch the actual row and call auth_require_owner($booking) inside each read, edit, or delete action. It returns a generic HTTP 404 and stops when the record is missing or its user_id differs from the signed-in user. For a different field pass auth_require_owner($booking, 'customer_id'). The check does not run automatically when a developer omits it.</w:t>
+      </w:r>
+    </w:p>
+    <w:p>
+      <w:pPr>
+        <w:pStyle w:val="Heading2"/>
+      </w:pPr>
+      <w:r>
+        <w:t>Upgrade an existing AuthO app</w:t>
+      </w:r>
+    </w:p>
+    <w:p>
+      <w:r>
+        <w:t>Back up the database and pause AuthO traffic. Merge the new packages/AuthO/files/app/Controllers/AuthController.php into app/Controllers/AuthController.php. Replace only the appended AuthO helper block in app/Helpers/helpers.php with packages/AuthO/files/helpers.php and preserve other package blocks. Run the commands below. Fresh AuthO activations receive the table through the normal migration.</w:t>
+      </w:r>
+    </w:p>
+    <w:p>
+      <w:pPr>
+        <w:pStyle w:val="CodeBlock"/>
+      </w:pPr>
+      <w:r>
+        <w:t>php artisan auth:upgrade</w:t>
+      </w:r>
+    </w:p>
+    <w:p>
+      <w:pPr>
+        <w:pStyle w:val="CodeBlock"/>
+      </w:pPr>
+      <w:r>
+        <w:t>composer dump-autoload</w:t>
+      </w:r>
+    </w:p>
+    <w:p>
+      <w:pPr>
+        <w:pStyle w:val="CodeBlock"/>
+      </w:pPr>
+      <w:r>
+        <w:t>php artisan test</w:t>
+      </w:r>
+    </w:p>
+    <w:p>
+      <w:r>
+        <w:t>Before reopening traffic, verify login, registration, password reset, 429 responses across two browser sessions, and ownership checks against MySQL and the real web server. The source build environment did not contain PHP, Composer, Apache, or MySQL, so these runtime paths still require staging validation.</w:t>
       </w:r>
     </w:p>
     <w:sectPr>

</xml_diff>